<commit_message>
Added data to autok.json, minor spelling correction, autok pics upload
</commit_message>
<xml_diff>
--- a/Autók.docx
+++ b/Autók.docx
@@ -196,7 +196,29 @@
           <w:bCs w:val="0"/>
           <w:shd w:val="clear" w:color="auto" w:fill="F4F4F4"/>
         </w:rPr>
-        <w:t>2.0 Hybrid GR Sport e-CVT</w:t>
+        <w:t xml:space="preserve">2.0 </w:t>
+      </w:r>
+      <w:proofErr w:type="spellStart"/>
+      <w:r>
+        <w:rPr>
+          <w:rStyle w:val="Kiemels2"/>
+          <w:rFonts w:cstheme="minorHAnsi"/>
+          <w:b w:val="0"/>
+          <w:bCs w:val="0"/>
+          <w:shd w:val="clear" w:color="auto" w:fill="F4F4F4"/>
+        </w:rPr>
+        <w:t>Hybrid</w:t>
+      </w:r>
+      <w:proofErr w:type="spellEnd"/>
+      <w:r>
+        <w:rPr>
+          <w:rStyle w:val="Kiemels2"/>
+          <w:rFonts w:cstheme="minorHAnsi"/>
+          <w:b w:val="0"/>
+          <w:bCs w:val="0"/>
+          <w:shd w:val="clear" w:color="auto" w:fill="F4F4F4"/>
+        </w:rPr>
+        <w:t xml:space="preserve"> GR Sport e-CVT</w:t>
       </w:r>
     </w:p>
     <w:p>
@@ -416,14 +438,7 @@
           <w:sz w:val="28"/>
           <w:szCs w:val="28"/>
         </w:rPr>
-        <w:t xml:space="preserve"> </w:t>
-      </w:r>
-      <w:r>
-        <w:rPr>
-          <w:sz w:val="28"/>
-          <w:szCs w:val="28"/>
-        </w:rPr>
-        <w:t>Audi</w:t>
+        <w:t xml:space="preserve"> Audi</w:t>
       </w:r>
     </w:p>
     <w:p>
@@ -467,14 +482,7 @@
           <w:sz w:val="28"/>
           <w:szCs w:val="28"/>
         </w:rPr>
-        <w:t xml:space="preserve"> </w:t>
-      </w:r>
-      <w:r>
-        <w:rPr>
-          <w:sz w:val="28"/>
-          <w:szCs w:val="28"/>
-        </w:rPr>
-        <w:t>2020</w:t>
+        <w:t xml:space="preserve"> 2020</w:t>
       </w:r>
     </w:p>
     <w:p>
@@ -496,21 +504,7 @@
           <w:sz w:val="28"/>
           <w:szCs w:val="28"/>
         </w:rPr>
-        <w:t xml:space="preserve"> </w:t>
-      </w:r>
-      <w:r>
-        <w:rPr>
-          <w:sz w:val="28"/>
-          <w:szCs w:val="28"/>
-        </w:rPr>
-        <w:t>45</w:t>
-      </w:r>
-      <w:r>
-        <w:rPr>
-          <w:sz w:val="28"/>
-          <w:szCs w:val="28"/>
-        </w:rPr>
-        <w:t> 000 Ft/hó</w:t>
+        <w:t xml:space="preserve"> 45 000 Ft/hó</w:t>
       </w:r>
     </w:p>
     <w:p>
@@ -686,14 +680,7 @@
           <w:sz w:val="28"/>
           <w:szCs w:val="28"/>
         </w:rPr>
-        <w:t xml:space="preserve"> </w:t>
-      </w:r>
-      <w:r>
-        <w:rPr>
-          <w:sz w:val="28"/>
-          <w:szCs w:val="28"/>
-        </w:rPr>
-        <w:t>Peugeot</w:t>
+        <w:t xml:space="preserve"> Peugeot</w:t>
       </w:r>
     </w:p>
     <w:p>
@@ -715,21 +702,7 @@
           <w:sz w:val="28"/>
           <w:szCs w:val="28"/>
         </w:rPr>
-        <w:t xml:space="preserve">: </w:t>
-      </w:r>
-      <w:r>
-        <w:rPr>
-          <w:sz w:val="28"/>
-          <w:szCs w:val="28"/>
-        </w:rPr>
-        <w:t xml:space="preserve">3008 </w:t>
-      </w:r>
-      <w:r>
-        <w:rPr>
-          <w:sz w:val="28"/>
-          <w:szCs w:val="28"/>
-        </w:rPr>
-        <w:t>(P64)</w:t>
+        <w:t>: 3008 (P64)</w:t>
       </w:r>
     </w:p>
     <w:p>
@@ -751,14 +724,7 @@
           <w:sz w:val="28"/>
           <w:szCs w:val="28"/>
         </w:rPr>
-        <w:t xml:space="preserve"> </w:t>
-      </w:r>
-      <w:r>
-        <w:rPr>
-          <w:sz w:val="28"/>
-          <w:szCs w:val="28"/>
-        </w:rPr>
-        <w:t>2024</w:t>
+        <w:t xml:space="preserve"> 2024</w:t>
       </w:r>
     </w:p>
     <w:p>
@@ -780,21 +746,7 @@
           <w:sz w:val="28"/>
           <w:szCs w:val="28"/>
         </w:rPr>
-        <w:t xml:space="preserve"> </w:t>
-      </w:r>
-      <w:r>
-        <w:rPr>
-          <w:sz w:val="28"/>
-          <w:szCs w:val="28"/>
-        </w:rPr>
-        <w:t>55 000</w:t>
-      </w:r>
-      <w:r>
-        <w:rPr>
-          <w:sz w:val="28"/>
-          <w:szCs w:val="28"/>
-        </w:rPr>
-        <w:t xml:space="preserve"> Ft/hó</w:t>
+        <w:t xml:space="preserve"> 55 000 Ft/hó</w:t>
       </w:r>
     </w:p>
     <w:p>
@@ -899,14 +851,99 @@
           <w:sz w:val="28"/>
           <w:szCs w:val="28"/>
         </w:rPr>
+        <w:t xml:space="preserve"> Renault </w:t>
+      </w:r>
+    </w:p>
+    <w:p>
+      <w:pPr>
+        <w:rPr>
+          <w:sz w:val="28"/>
+          <w:szCs w:val="28"/>
+        </w:rPr>
+      </w:pPr>
+      <w:r>
+        <w:rPr>
+          <w:sz w:val="28"/>
+          <w:szCs w:val="28"/>
+        </w:rPr>
+        <w:t>Modell</w:t>
+      </w:r>
+      <w:r>
+        <w:rPr>
+          <w:sz w:val="28"/>
+          <w:szCs w:val="28"/>
+        </w:rPr>
+        <w:t xml:space="preserve">: </w:t>
+      </w:r>
+      <w:proofErr w:type="spellStart"/>
+      <w:r>
+        <w:rPr>
+          <w:sz w:val="28"/>
+          <w:szCs w:val="28"/>
+        </w:rPr>
+        <w:t>Trafic</w:t>
+      </w:r>
+      <w:proofErr w:type="spellEnd"/>
+      <w:r>
+        <w:rPr>
+          <w:sz w:val="28"/>
+          <w:szCs w:val="28"/>
+        </w:rPr>
+        <w:t xml:space="preserve"> Combi</w:t>
+      </w:r>
+      <w:r>
+        <w:rPr>
+          <w:sz w:val="28"/>
+          <w:szCs w:val="28"/>
+        </w:rPr>
         <w:t xml:space="preserve"> </w:t>
       </w:r>
-      <w:r>
-        <w:rPr>
-          <w:sz w:val="28"/>
-          <w:szCs w:val="28"/>
-        </w:rPr>
-        <w:t>Renault</w:t>
+      <w:proofErr w:type="spellStart"/>
+      <w:r>
+        <w:rPr>
+          <w:sz w:val="28"/>
+          <w:szCs w:val="28"/>
+        </w:rPr>
+        <w:t>Equilibre</w:t>
+      </w:r>
+      <w:proofErr w:type="spellEnd"/>
+      <w:r>
+        <w:rPr>
+          <w:sz w:val="28"/>
+          <w:szCs w:val="28"/>
+        </w:rPr>
+        <w:t xml:space="preserve"> L2H1 </w:t>
+      </w:r>
+      <w:proofErr w:type="spellStart"/>
+      <w:r>
+        <w:rPr>
+          <w:sz w:val="28"/>
+          <w:szCs w:val="28"/>
+        </w:rPr>
+        <w:t>Blue</w:t>
+      </w:r>
+      <w:proofErr w:type="spellEnd"/>
+      <w:r>
+        <w:rPr>
+          <w:sz w:val="28"/>
+          <w:szCs w:val="28"/>
+        </w:rPr>
+        <w:t xml:space="preserve"> DCI 150</w:t>
+      </w:r>
+    </w:p>
+    <w:p>
+      <w:pPr>
+        <w:rPr>
+          <w:sz w:val="28"/>
+          <w:szCs w:val="28"/>
+        </w:rPr>
+      </w:pPr>
+      <w:r>
+        <w:rPr>
+          <w:sz w:val="28"/>
+          <w:szCs w:val="28"/>
+        </w:rPr>
+        <w:t>Évjárat:</w:t>
       </w:r>
       <w:r>
         <w:rPr>
@@ -915,56 +952,27 @@
         </w:rPr>
         <w:t xml:space="preserve"> </w:t>
       </w:r>
-    </w:p>
-    <w:p>
-      <w:pPr>
-        <w:rPr>
-          <w:sz w:val="28"/>
-          <w:szCs w:val="28"/>
-        </w:rPr>
-      </w:pPr>
-      <w:r>
-        <w:rPr>
-          <w:sz w:val="28"/>
-          <w:szCs w:val="28"/>
-        </w:rPr>
-        <w:t>Modell</w:t>
-      </w:r>
-      <w:r>
-        <w:rPr>
-          <w:sz w:val="28"/>
-          <w:szCs w:val="28"/>
-        </w:rPr>
-        <w:t xml:space="preserve">: </w:t>
-      </w:r>
-      <w:r>
-        <w:rPr>
-          <w:sz w:val="28"/>
-          <w:szCs w:val="28"/>
-        </w:rPr>
-        <w:t>Trafic Combi</w:t>
-      </w:r>
-      <w:r>
-        <w:rPr>
-          <w:sz w:val="28"/>
-          <w:szCs w:val="28"/>
-        </w:rPr>
-        <w:t xml:space="preserve"> Equilibre L2H1 Blue DCI 150</w:t>
-      </w:r>
-    </w:p>
-    <w:p>
-      <w:pPr>
-        <w:rPr>
-          <w:sz w:val="28"/>
-          <w:szCs w:val="28"/>
-        </w:rPr>
-      </w:pPr>
-      <w:r>
-        <w:rPr>
-          <w:sz w:val="28"/>
-          <w:szCs w:val="28"/>
-        </w:rPr>
-        <w:t>Évjárat:</w:t>
+      <w:r>
+        <w:rPr>
+          <w:sz w:val="28"/>
+          <w:szCs w:val="28"/>
+        </w:rPr>
+        <w:t>2022</w:t>
+      </w:r>
+    </w:p>
+    <w:p>
+      <w:pPr>
+        <w:rPr>
+          <w:sz w:val="28"/>
+          <w:szCs w:val="28"/>
+        </w:rPr>
+      </w:pPr>
+      <w:r>
+        <w:rPr>
+          <w:sz w:val="28"/>
+          <w:szCs w:val="28"/>
+        </w:rPr>
+        <w:t>Ár:</w:t>
       </w:r>
       <w:r>
         <w:rPr>
@@ -978,35 +986,6 @@
           <w:sz w:val="28"/>
           <w:szCs w:val="28"/>
         </w:rPr>
-        <w:t>2022</w:t>
-      </w:r>
-    </w:p>
-    <w:p>
-      <w:pPr>
-        <w:rPr>
-          <w:sz w:val="28"/>
-          <w:szCs w:val="28"/>
-        </w:rPr>
-      </w:pPr>
-      <w:r>
-        <w:rPr>
-          <w:sz w:val="28"/>
-          <w:szCs w:val="28"/>
-        </w:rPr>
-        <w:t>Ár:</w:t>
-      </w:r>
-      <w:r>
-        <w:rPr>
-          <w:sz w:val="28"/>
-          <w:szCs w:val="28"/>
-        </w:rPr>
-        <w:t xml:space="preserve"> </w:t>
-      </w:r>
-      <w:r>
-        <w:rPr>
-          <w:sz w:val="28"/>
-          <w:szCs w:val="28"/>
-        </w:rPr>
         <w:t>70 000</w:t>
       </w:r>
       <w:r>
@@ -1032,15 +1011,7 @@
           <w:szCs w:val="28"/>
         </w:rPr>
         <w:lastRenderedPageBreak/>
-        <w:t>Citroën</w:t>
-      </w:r>
-      <w:r>
-        <w:rPr>
-          <w:rFonts w:ascii="Arial" w:hAnsi="Arial" w:cs="Arial"/>
-          <w:sz w:val="28"/>
-          <w:szCs w:val="28"/>
-        </w:rPr>
-        <w:t>:</w:t>
+        <w:t>Citroën:</w:t>
       </w:r>
     </w:p>
     <w:p>
@@ -1191,14 +1162,7 @@
           <w:sz w:val="28"/>
           <w:szCs w:val="28"/>
         </w:rPr>
-        <w:t xml:space="preserve"> </w:t>
-      </w:r>
-      <w:r>
-        <w:rPr>
-          <w:sz w:val="28"/>
-          <w:szCs w:val="28"/>
-        </w:rPr>
-        <w:t>2024</w:t>
+        <w:t xml:space="preserve"> 2024</w:t>
       </w:r>
     </w:p>
     <w:p>
@@ -1220,21 +1184,7 @@
           <w:sz w:val="28"/>
           <w:szCs w:val="28"/>
         </w:rPr>
-        <w:t xml:space="preserve"> </w:t>
-      </w:r>
-      <w:r>
-        <w:rPr>
-          <w:sz w:val="28"/>
-          <w:szCs w:val="28"/>
-        </w:rPr>
-        <w:t>47 000</w:t>
-      </w:r>
-      <w:r>
-        <w:rPr>
-          <w:sz w:val="28"/>
-          <w:szCs w:val="28"/>
-        </w:rPr>
-        <w:t xml:space="preserve"> Ft/hó</w:t>
+        <w:t xml:space="preserve"> 47 000 Ft/hó</w:t>
       </w:r>
     </w:p>
     <w:p>
@@ -1378,13 +1328,23 @@
         </w:rPr>
         <w:t xml:space="preserve">: </w:t>
       </w:r>
+      <w:proofErr w:type="spellStart"/>
       <w:r>
         <w:rPr>
           <w:rFonts w:ascii="Arial" w:hAnsi="Arial" w:cs="Arial"/>
           <w:sz w:val="28"/>
           <w:szCs w:val="28"/>
         </w:rPr>
-        <w:t>Astra L</w:t>
+        <w:t>Astra</w:t>
+      </w:r>
+      <w:proofErr w:type="spellEnd"/>
+      <w:r>
+        <w:rPr>
+          <w:rFonts w:ascii="Arial" w:hAnsi="Arial" w:cs="Arial"/>
+          <w:sz w:val="28"/>
+          <w:szCs w:val="28"/>
+        </w:rPr>
+        <w:t xml:space="preserve"> L</w:t>
       </w:r>
     </w:p>
     <w:p>
@@ -1451,38 +1411,6 @@
         </w:rPr>
         <w:t xml:space="preserve"> 000 Ft/hó</w:t>
       </w:r>
-    </w:p>
-    <w:p>
-      <w:pPr>
-        <w:rPr>
-          <w:sz w:val="28"/>
-          <w:szCs w:val="28"/>
-        </w:rPr>
-      </w:pPr>
-    </w:p>
-    <w:p>
-      <w:pPr>
-        <w:rPr>
-          <w:sz w:val="28"/>
-          <w:szCs w:val="28"/>
-        </w:rPr>
-      </w:pPr>
-    </w:p>
-    <w:p>
-      <w:pPr>
-        <w:rPr>
-          <w:sz w:val="28"/>
-          <w:szCs w:val="28"/>
-        </w:rPr>
-      </w:pPr>
-    </w:p>
-    <w:p>
-      <w:pPr>
-        <w:rPr>
-          <w:sz w:val="28"/>
-          <w:szCs w:val="28"/>
-        </w:rPr>
-      </w:pPr>
     </w:p>
     <w:sectPr>
       <w:pgSz w:w="11906" w:h="16838"/>

</xml_diff>